<commit_message>
Improve OTProof docs for mixed audiences
</commit_message>
<xml_diff>
--- a/OTProof_Idea_Document.docx
+++ b/OTProof_Idea_Document.docx
@@ -25,7 +25,7 @@
           <w:color w:val="25A99A"/>
           <w:sz w:val="34"/>
         </w:rPr>
-        <w:t>AI-powered industrial vulnerability applicability and remediation assurance</w:t>
+        <w:t>Check which public security notices may affect industrial equipment, then keep the human review and evidence together.</w:t>
       </w:r>
     </w:p>
     <w:tbl>
@@ -216,7 +216,7 @@
         <w:pStyle w:val="Heading1"/>
       </w:pPr>
       <w:r>
-        <w:t>The problem sits between the inventory and the advisory</w:t>
+        <w:t>OTProof in plain language</w:t>
       </w:r>
     </w:p>
     <w:p>
@@ -228,7 +228,7 @@
           <w:color w:val="63777C"/>
           <w:sz w:val="22"/>
         </w:rPr>
-        <w:t>A published CVE is not enough to know which operational asset needs engineering attention.</w:t>
+        <w:t>It connects an equipment list to public security notices. It points people to records worth checking; it does not touch equipment or make operational decisions.</w:t>
       </w:r>
     </w:p>
     <w:p>
@@ -236,7 +236,7 @@
         <w:pStyle w:val="Heading2"/>
       </w:pPr>
       <w:r>
-        <w:t>Three records that rarely line up cleanly</w:t>
+        <w:t>A simple example</w:t>
       </w:r>
     </w:p>
     <w:p>
@@ -244,7 +244,7 @@
         <w:keepLines/>
       </w:pPr>
       <w:r>
-        <w:t>Operators track asset names, models, software/firmware, site, criticality, and owners across maintenance records and spreadsheets. Advisory publishers use product families, version ranges, configuration conditions, and vendor terminology. Security and engineering teams reconcile them under time pressure.</w:t>
+        <w:t>A real CISA notice says FactoryTalk View Site Edition version 13.0 is affected. In our fictional water utility, asset CV-HMI-001 is version 13.0.0, so OTProof shows a possible match and links the notice. CV-HMI-002 is version 14.0, which is outside that notice's version statement. CV-HMI-005 has no recorded version, so OTProof asks an engineer to check. None of these results means equipment was changed or fixed.</w:t>
       </w:r>
     </w:p>
     <w:p>
@@ -252,7 +252,7 @@
         <w:pStyle w:val="Heading2"/>
       </w:pPr>
       <w:r>
-        <w:t>False certainty has a cost</w:t>
+        <w:t>People make the important calls</w:t>
       </w:r>
     </w:p>
     <w:p>
@@ -260,7 +260,7 @@
         <w:keepLines/>
       </w:pPr>
       <w:r>
-        <w:t>A superficial product-name match can create noise; a missing or stale version can hide a relevant case. OT teams must also assess process impact, approved change windows, vendor support, and operational safety before acting.</w:t>
+        <w:t>A reviewer decides whether the notice fits the asset and records why. An engineer proposes any work and its timing. An approver accepts or rejects that plan. After work, the team adds evidence and an approver verifies it. AI can help read the notice, but it cannot make those decisions.</w:t>
       </w:r>
     </w:p>
     <w:p>
@@ -268,7 +268,7 @@
         <w:pStyle w:val="Heading2"/>
       </w:pPr>
       <w:r>
-        <w:t>Why now</w:t>
+        <w:t>Quick translations</w:t>
       </w:r>
     </w:p>
     <w:p>
@@ -276,7 +276,7 @@
         <w:keepLines/>
       </w:pPr>
       <w:r>
-        <w:t>NIST SP 800-82 Rev. 3 identifies accurate inventory details such as vendor, model, software/firmware version, location, and roles as useful to OT risk management. It also recognizes that active collection methods may affect OT and need careful consideration. OTProof begins with an operator-supplied inventory and stays out of the control network.</w:t>
+        <w:t>OT means operational technology: computers and controllers that monitor or run physical processes such as water pumps. A vulnerability notice describes a software or product weakness. A CVE is the public ID assigned to a specific vulnerability. Evidence is a record that supports a human decision, such as a change reference or test result.</w:t>
       </w:r>
     </w:p>
     <w:tbl>
@@ -303,7 +303,135 @@
                 <w:color w:val="122430"/>
                 <w:sz w:val="16"/>
               </w:rPr>
-              <w:t>The product produces a source-backed triage candidate, not a safety, exploitability, or remediation verdict.</w:t>
+              <w:t>OTProof is a careful checklist and record keeper: it highlights what may need attention, while authorized people decide what to do.</w:t>
+            </w:r>
+          </w:p>
+        </w:tc>
+      </w:tr>
+    </w:tbl>
+    <w:p>
+      <w:pPr>
+        <w:spacing w:after="20"/>
+      </w:pPr>
+      <w:r>
+        <w:rPr>
+          <w:color w:val="63777C"/>
+          <w:sz w:val="14"/>
+        </w:rPr>
+        <w:t>Worked example source: CISA ICSA-24-226-06 · https://www.cisa.gov/news-events/ics-advisories/icsa-24-226-06</w:t>
+      </w:r>
+    </w:p>
+    <w:p>
+      <w:r>
+        <w:br w:type="page"/>
+      </w:r>
+    </w:p>
+    <w:p>
+      <w:pPr>
+        <w:spacing w:before="200" w:after="100"/>
+      </w:pPr>
+      <w:r>
+        <w:rPr>
+          <w:b/>
+          <w:color w:val="25A99A"/>
+          <w:sz w:val="16"/>
+        </w:rPr>
+        <w:t>PROJECT IDEA  /  OT CYBERSECURITY</w:t>
+      </w:r>
+    </w:p>
+    <w:p>
+      <w:pPr>
+        <w:pStyle w:val="Heading1"/>
+      </w:pPr>
+      <w:r>
+        <w:t>The inventory and the security notice speak different languages</w:t>
+      </w:r>
+    </w:p>
+    <w:p>
+      <w:pPr>
+        <w:spacing w:after="260"/>
+      </w:pPr>
+      <w:r>
+        <w:rPr>
+          <w:color w:val="63777C"/>
+          <w:sz w:val="22"/>
+        </w:rPr>
+        <w:t>A public vulnerability notice alone does not say which equipment at a particular site needs engineering attention.</w:t>
+      </w:r>
+    </w:p>
+    <w:p>
+      <w:pPr>
+        <w:pStyle w:val="Heading2"/>
+      </w:pPr>
+      <w:r>
+        <w:t>Three records that rarely line up cleanly</w:t>
+      </w:r>
+    </w:p>
+    <w:p>
+      <w:pPr>
+        <w:keepLines/>
+      </w:pPr>
+      <w:r>
+        <w:t>Operators track equipment names, models, software versions, locations, importance, and owners in spreadsheets and maintenance systems. Security notices may use different product names and list affected versions in a different format. Security and engineering teams have to compare the records and keep track of their reasoning.</w:t>
+      </w:r>
+    </w:p>
+    <w:p>
+      <w:pPr>
+        <w:pStyle w:val="Heading2"/>
+      </w:pPr>
+      <w:r>
+        <w:t>False certainty has a cost</w:t>
+      </w:r>
+    </w:p>
+    <w:p>
+      <w:pPr>
+        <w:keepLines/>
+      </w:pPr>
+      <w:r>
+        <w:t>A loose name match can create false alarms. Missing or old version details can hide a real concern. Before changing industrial equipment, the team must consider process impact, vendor guidance, maintenance schedules, and safety.</w:t>
+      </w:r>
+    </w:p>
+    <w:p>
+      <w:pPr>
+        <w:pStyle w:val="Heading2"/>
+      </w:pPr>
+      <w:r>
+        <w:t>Why now</w:t>
+      </w:r>
+    </w:p>
+    <w:p>
+      <w:pPr>
+        <w:keepLines/>
+      </w:pPr>
+      <w:r>
+        <w:t>NIST's final OT security guide recommends keeping accurate records of equipment, vendors, software versions, locations, and responsible roles. OTProof starts from a file the operator provides and does not connect to industrial equipment.</w:t>
+      </w:r>
+    </w:p>
+    <w:tbl>
+      <w:tblPr>
+        <w:tblW w:type="auto" w:w="0"/>
+        <w:tblLook w:firstColumn="1" w:firstRow="1" w:lastColumn="0" w:lastRow="0" w:noHBand="0" w:noVBand="1" w:val="04A0"/>
+      </w:tblPr>
+      <w:tblGrid>
+        <w:gridCol w:w="9835"/>
+      </w:tblGrid>
+      <w:tr>
+        <w:tc>
+          <w:tcPr>
+            <w:tcW w:type="dxa" w:w="9835"/>
+            <w:vAlign w:val="center"/>
+          </w:tcPr>
+          <w:p>
+            <w:pPr>
+              <w:spacing w:before="80" w:after="80"/>
+            </w:pPr>
+            <w:r>
+              <w:rPr>
+                <w:b/>
+                <w:color w:val="122430"/>
+                <w:sz w:val="16"/>
+              </w:rPr>
+              <w:t>The product shows a possible match with its source. It does not decide whether a change is safe or whether work is complete.</w:t>
             </w:r>
           </w:p>
         </w:tc>
@@ -332,7 +460,7 @@
         <w:pStyle w:val="Heading1"/>
       </w:pPr>
       <w:r>
-        <w:t>A single workflow from source to verified evidence</w:t>
+        <w:t>From security notice to reviewed evidence</w:t>
       </w:r>
     </w:p>
     <w:p>
@@ -360,7 +488,7 @@
         <w:keepLines/>
       </w:pPr>
       <w:r>
-        <w:t>Import a CSV or XLSX file with asset identity, vendor, product/model, version, type, site, criticality, owner, and last verification date. Reject duplicate identifiers, oversized uploads, and macro-enabled workbooks.</w:t>
+        <w:t>Load an inventory spreadsheet with each asset's ID, maker, product/model, software version, type, site, importance, owner, and last check date. OTProof checks required fields and rejects duplicate IDs, very large uploads, and macro-enabled workbooks.</w:t>
       </w:r>
     </w:p>
     <w:p>
@@ -376,7 +504,7 @@
         <w:keepLines/>
       </w:pPr>
       <w:r>
-        <w:t>Fetch CISA ICS RSS/advisory/CSAF, CISA KEV JSON, NVD CVE API 2.0, or a bulletin on an approved vendor HTTPS domain. Cache payloads and preserve source URLs and timestamps.</w:t>
+        <w:t>Load public security notices from CISA, the CISA list of known exploited vulnerabilities, NIST's vulnerability database, or an approved vendor website. OTProof saves when and where each record came from so the team can check it later.</w:t>
       </w:r>
     </w:p>
     <w:p>
@@ -392,7 +520,7 @@
         <w:keepLines/>
       </w:pPr>
       <w:r>
-        <w:t>The deterministic matcher returns applicable, not applicable, or manual verification. An engineer records the applicability decision and rationale; an approver accepts or rejects a proposed ticket; evidence is attached and separately verified by an approver; JSON/PDF reports retain sources and audit history.</w:t>
+        <w:t>The comparison returns one of three results: likely affected, does not match this notice, or needs a human check. A reviewer records the decision and reason. An engineer proposes work, an approver reviews it, and later an approver checks the supporting evidence. Reports preserve the sources and action history.</w:t>
       </w:r>
     </w:p>
     <w:tbl>
@@ -419,7 +547,7 @@
                 <w:color w:val="122430"/>
                 <w:sz w:val="16"/>
               </w:rPr>
-              <w:t>A ticket or generated narrative cannot mark a finding remediated. Only an approver verification tied to evidence can.</w:t>
+              <w:t>A proposed fix or AI-written summary cannot count as proof that work is complete. An authorized person must check evidence.</w:t>
             </w:r>
           </w:p>
         </w:tc>
@@ -448,7 +576,7 @@
         <w:pStyle w:val="Heading1"/>
       </w:pPr>
       <w:r>
-        <w:t>A modular, offline-capable architecture</w:t>
+        <w:t>How the application is built</w:t>
       </w:r>
     </w:p>
     <w:p>
@@ -476,7 +604,7 @@
         <w:keepLines/>
       </w:pPr>
       <w:r>
-        <w:t>React + TypeScript dashboard → FastAPI/Pydantic API → SQLAlchemy and PostgreSQL. SQLite supports a quick local run. Alembic manages schema changes. ReportLab exports assurance reports. Docker Compose packages the database, API, and frontend.</w:t>
+        <w:t>A web dashboard sends requests to one service that validates data, applies matching rules, and records decisions in a database. The implementation uses React/TypeScript, FastAPI/Pydantic, and PostgreSQL; SQLite supports a quick local demo. ReportLab creates PDF reports, and Docker Compose packages the components.</w:t>
       </w:r>
     </w:p>
     <w:p>
@@ -492,7 +620,7 @@
         <w:keepLines/>
       </w:pPr>
       <w:r>
-        <w:t>The ingestion service uses documented CISA RSS/JSON, NVD CVE API 2.0, CISA-linked CSAF documents, and an allowlist of vendor bulletin domains. Conditional cache headers, a configurable TTL, bounded retries, and stale-copy fallback support outages.</w:t>
+        <w:t>The source service uses documented public CISA and NIST feeds, CISA-linked advisory files, and approved vendor websites. It avoids unnecessary repeat downloads, retries temporary rate limits, and can use a saved older copy when a source is unavailable.</w:t>
       </w:r>
     </w:p>
     <w:p>
@@ -500,7 +628,7 @@
         <w:pStyle w:val="Heading2"/>
       </w:pPr>
       <w:r>
-        <w:t>Explicit trust boundaries</w:t>
+        <w:t>What the system can and cannot do</w:t>
       </w:r>
     </w:p>
     <w:p>
@@ -508,7 +636,7 @@
         <w:keepLines/>
       </w:pPr>
       <w:r>
-        <w:t>There is no OT interface, protocol client, scanner, exploit capability, or control action. The optional local LLM adapter receives advisory text only and cannot write applicability decisions or workflow status.</w:t>
+        <w:t>There is no connection to industrial devices, no network scanner, no exploit tool, and no way to change equipment. The optional local AI helper can read notice text and draft fields, but it cannot decide whether a vulnerability applies or mark work complete.</w:t>
       </w:r>
     </w:p>
     <w:tbl>
@@ -535,7 +663,7 @@
                 <w:color w:val="122430"/>
                 <w:sz w:val="16"/>
               </w:rPr>
-              <w:t>Deployment for real operators requires managed identity, secret rotation, allowlisted egress, backup/restore, and independent security review.</w:t>
+              <w:t>Before a real operator uses it: add company login, protect and rotate secrets, limit internet access, test backup and restore, and complete an independent security review.</w:t>
             </w:r>
           </w:p>
         </w:tc>
@@ -564,7 +692,7 @@
         <w:pStyle w:val="Heading1"/>
       </w:pPr>
       <w:r>
-        <w:t>Deterministic matching earns each conclusion</w:t>
+        <w:t>The matching rules show their work</w:t>
       </w:r>
     </w:p>
     <w:p>
@@ -576,7 +704,7 @@
           <w:color w:val="63777C"/>
           <w:sz w:val="22"/>
         </w:rPr>
-        <w:t>Product identity and version evidence are more useful than an unexplained similarity score.</w:t>
+        <w:t>OTProof compares product identity and published version limits. If it cannot tell, it asks a person to check.</w:t>
       </w:r>
     </w:p>
     <w:p>
@@ -592,7 +720,7 @@
         <w:keepLines/>
       </w:pPr>
       <w:r>
-        <w:t>A curated alias map normalizes a small set of known vendor/product variants. Exact normalized product identity is followed by conservative dotted-numeric version comparison against published equality or inclusive/exclusive bounds. Constraints in one NVD CPE match are conjunctive; alternatives remain separate candidate products.</w:t>
+        <w:t>A small reviewed list handles known spelling variations. The product name must match, then the installed version is compared with the affected version or range stated by the publisher. Every required condition must match; separate affected products are checked as separate possibilities.</w:t>
       </w:r>
     </w:p>
     <w:p>
@@ -608,7 +736,7 @@
         <w:keepLines/>
       </w:pPr>
       <w:r>
-        <w:t>Missing firmware, unknown model, possible duplicate asset, inventory older than 180 days, unsupported suffix/version syntax, ambiguous product identity, and compound or negated NVD configurations require an engineering review. Semantic similarity never decides applicability.</w:t>
+        <w:t>Missing software version, unknown model, a possible duplicate asset, inventory older than 180 days, unfamiliar version format, unclear product identity, or complicated source conditions all require an engineering review. A similar-sounding name is never enough to call a vulnerability applicable.</w:t>
       </w:r>
     </w:p>
     <w:p>
@@ -624,7 +752,7 @@
         <w:keepLines/>
       </w:pPr>
       <w:r>
-        <w:t>An optional local Ollama-compatible model can draft structured product/version/CVE extraction, summaries, uncertainty explanations, and review suggestions. Pydantic validates the response and extracted identifiers/quotes are checked against the source text. The LLM is not used by the matcher or state machine.</w:t>
+        <w:t>An optional AI model running on the user's computer can suggest product, version, vulnerability ID, mitigation, and summary fields. Required fields are checked and quoted details are compared with the original notice. The AI suggestion does not affect the matching result or workflow status.</w:t>
       </w:r>
     </w:p>
     <w:tbl>
@@ -651,7 +779,7 @@
                 <w:color w:val="122430"/>
                 <w:sz w:val="16"/>
               </w:rPr>
-              <w:t>Default model name: Qwen2.5 7B Instruct via Ollama (Apache-2.0 model repository, MIT runtime). No inference was run for this MVP evaluation.</w:t>
+              <w:t>No AI model was run during evaluation. Its accuracy has not been measured; a person must check every suggestion.</w:t>
             </w:r>
           </w:p>
         </w:tc>
@@ -680,7 +808,7 @@
         <w:pStyle w:val="Heading1"/>
       </w:pPr>
       <w:r>
-        <w:t>Human decisions create the assurance record</w:t>
+        <w:t>People review work and verify evidence</w:t>
       </w:r>
     </w:p>
     <w:p>
@@ -708,7 +836,7 @@
         <w:keepLines/>
       </w:pPr>
       <w:r>
-        <w:t>A reviewer can run analysis and record an applicable/not-applicable decision with a rationale. An engineer can propose a mitigation, owner, and due date. An approver independently accepts/rejects the ticket. Evidence is then attached with a hash and reference; an approver verifies a selected record and supplies a rationale.</w:t>
+        <w:t>The reviewer checks whether the notice applies and records the reason. The engineer proposes a safe action, an owner, and a due date. A different person approves or rejects the plan. After the work, the team adds a change or test record; an approver checks it and records why it is sufficient.</w:t>
       </w:r>
     </w:p>
     <w:p>
@@ -724,7 +852,7 @@
         <w:keepLines/>
       </w:pPr>
       <w:r>
-        <w:t>Application actions create append-only audit events with actor, role, timestamp, entity, and details. The report includes source publication/update dates, matching reasons, human decisions, remediation state, evidence references/hashes, and audit history.</w:t>
+        <w:t>The system records who did what and when. The report includes the source publication and update dates, matching reasons, human decisions, work status, evidence references, and action history. Evidence records include a digital fingerprint so later changes can be detected when compared with the original.</w:t>
       </w:r>
     </w:p>
     <w:p>
@@ -740,7 +868,7 @@
         <w:keepLines/>
       </w:pPr>
       <w:r>
-        <w:t>Demo bearer tokens are intentionally visible and unsafe for production. The audit database is not WORM or cryptographically immutable. Evidence is text/metadata rather than binary attachments. No certification, compliance determination, or verified operational-risk reduction is claimed.</w:t>
+        <w:t>The demo passwords are visible and unsafe for real use. A database administrator could change stored audit records. Evidence is a text record or reference, not an uploaded file. OTProof does not certify compliance or prove that operational risk was reduced.</w:t>
       </w:r>
     </w:p>
     <w:tbl>
@@ -767,7 +895,7 @@
                 <w:color w:val="122430"/>
                 <w:sz w:val="16"/>
               </w:rPr>
-              <w:t>The demo evidence is simulated. Verification changes application workflow status; it does not attest to a real plant modification.</w:t>
+              <w:t>Demo evidence is fictional. Marking it verified changes the demo record only; it does not prove a real plant change occurred.</w:t>
             </w:r>
           </w:p>
         </w:tc>
@@ -796,7 +924,7 @@
         <w:pStyle w:val="Heading1"/>
       </w:pPr>
       <w:r>
-        <w:t>Commercial opportunity: focused assurance around OT data</w:t>
+        <w:t>Potential customers and business model</w:t>
       </w:r>
     </w:p>
     <w:p>
@@ -840,7 +968,7 @@
         <w:keepLines/>
       </w:pPr>
       <w:r>
-        <w:t>Claroty, Tenable, and Nozomi publicly describe broad OT asset visibility, vulnerability/exposure management, monitoring, and remediation workflows. ServiceNow and other GRC/IRM suites manage enterprise risk, controls, audit, and work processes. OTProof's possible wedge is a local, source-linked and conservative review workflow that may complement existing products; this is a hypothesis, not a demonstrated product advantage. Better evidence handover may support audit preparation and help operators review exposure sooner, but neither compliance outcomes nor risk reduction have been measured.</w:t>
+        <w:t>Claroty, Tenable, and Nozomi publicly describe broad industrial equipment visibility, vulnerability management, monitoring, and remediation workflows. ServiceNow and similar risk and compliance systems manage controls, audits, and work records. OTProof may offer a local, source-linked review workflow that complements them; this is a hypothesis, not a proven advantage. Better evidence handover may help audit preparation, but compliance outcomes and risk reduction have not been measured.</w:t>
       </w:r>
     </w:p>
     <w:p>
@@ -856,7 +984,7 @@
         <w:keepLines/>
       </w:pPr>
       <w:r>
-        <w:t>Assume 3 licensed sites per customer at $36,000/site/year; $25,000 onboarding per new customer; 78% recurring software gross margin; and 40% onboarding-services gross margin. The scenarios below are arithmetic examples only—not bookings, market sizing, or a forecast.</w:t>
+        <w:t>For illustration only, assume 3 sites per customer at $36,000 per site each year, $25,000 one-time setup for each new customer, and assumed profit margins of 78% on software and 40% on setup services. These are arithmetic examples, not sales, market size, or a forecast.</w:t>
       </w:r>
     </w:p>
     <w:tbl>
@@ -1237,7 +1365,7 @@
                 <w:color w:val="122430"/>
                 <w:sz w:val="16"/>
               </w:rPr>
-              <w:t>Other revenue paths: enterprise license, integrations, deployment, and ongoing assurance services. Price and margin assumptions need buyer interviews and cost validation.</w:t>
+              <w:t>ARR means yearly subscription income. Gross margin is the share left after direct delivery costs; gross profit is that amount in dollars. Prices and margins need buyer interviews and cost validation.</w:t>
             </w:r>
           </w:p>
         </w:tc>
@@ -1294,7 +1422,7 @@
         <w:keepLines/>
       </w:pPr>
       <w:r>
-        <w:t>14 labeled asset/advisory pairs: 4 applicable, 4 not applicable, and 6 expected manual verification. The deterministic matcher produced 14/14 expected labels, 100% precision/recall on four positive fixture examples, 0 labeled false negatives, and 6/6 expected abstentions. Every labeled result retained source ID, URL, and excerpt.</w:t>
+        <w:t>The test set has 14 hand-labeled asset/notice examples: 4 likely affected, 4 outside the published affected details, and 6 that should go to human review. The matcher returned the expected result on all 14. It found all 4 affected examples and missed none in this small test set. It also sent all 6 uncertain examples to review. Each result kept the source ID, link, and relevant source text.</w:t>
       </w:r>
     </w:p>
     <w:p>
@@ -1310,7 +1438,7 @@
         <w:keepLines/>
       </w:pPr>
       <w:r>
-        <w:t>One in-process pass over 80 assets × 3 advisories (240 pairs) measured about 1.01 ms on the development machine; this excludes network, database, and human review. Tests cover stale-cache fallback, duplicate IDs, macro-enabled workbook rejection, source quote validation, prompt injection as untrusted data, role authorization, and remediation evidence verification.</w:t>
+        <w:t>A single local software-only run compared 80 fictional assets with 3 notices (240 comparisons) in about 1.01 ms. This does not include internet, database, or human review time. Tests cover unavailable sources, duplicate IDs, unsafe spreadsheets, unsupported AI claims, role permissions, and evidence review.</w:t>
       </w:r>
     </w:p>
     <w:p>
@@ -1326,7 +1454,7 @@
         <w:keepLines/>
       </w:pPr>
       <w:r>
-        <w:t>Next: (1) invite 3–5 operator design partners, (2) label a diverse, source-reviewed multi-vendor dataset, (3) run blinded engineering adjudication and measure false negatives/abstentions, (4) add SSO, durable audit export, and CMMS/GRC connectors, (5) conduct a threat model and deployment review. Ask: a water/energy operator and OT engineers to validate the workflow, data fields, and trust boundaries.</w:t>
+        <w:t>Next, invite 3–5 operators and service providers to test the workflow. Ask engineers to label examples before seeing OTProof's results, then compare disagreements. Measure missed cases, human-review cases, time per review, and setup effort across several vendors. Add company login, protected audit export, and maintenance/risk-system connections only after users confirm the need. Ask a water or energy operator and its engineers to join this evaluation.</w:t>
       </w:r>
     </w:p>
     <w:tbl>
@@ -1353,7 +1481,7 @@
                 <w:color w:val="122430"/>
                 <w:sz w:val="16"/>
               </w:rPr>
-              <w:t>Human review time, AI extraction accuracy, field accuracy, cost savings, and production performance remain unmeasured.</w:t>
+              <w:t>Not measured yet: operator accuracy, human review time, AI quality, savings, or production performance.</w:t>
             </w:r>
           </w:p>
         </w:tc>

</xml_diff>